<commit_message>
added a new categorical constraint to title of advisor
</commit_message>
<xml_diff>
--- a/My Assumptions.docx
+++ b/My Assumptions.docx
@@ -191,7 +191,28 @@
         </w:numPr>
       </w:pPr>
       <w:r>
-        <w:t>Academic Title (Title)</w:t>
+        <w:t>Academic Title (Title</w:t>
+      </w:r>
+      <w:r>
+        <w:t xml:space="preserve">: </w:t>
+      </w:r>
+      <w:r>
+        <w:t>Doctor</w:t>
+      </w:r>
+      <w:r>
+        <w:t>/</w:t>
+      </w:r>
+      <w:r>
+        <w:t>Professor</w:t>
+      </w:r>
+      <w:r>
+        <w:t>/</w:t>
+      </w:r>
+      <w:r>
+        <w:t>Emeritus</w:t>
+      </w:r>
+      <w:r>
+        <w:t>)</w:t>
       </w:r>
     </w:p>
     <w:p>
@@ -2647,10 +2668,7 @@
         <w:t xml:space="preserve"> </w:t>
       </w:r>
       <w:r>
-        <w:t>Status</w:t>
-      </w:r>
-      <w:r>
-        <w:t xml:space="preserve"> of </w:t>
+        <w:t xml:space="preserve">Status of </w:t>
       </w:r>
       <w:r>
         <w:rPr>
@@ -2722,10 +2740,7 @@
         <w:t xml:space="preserve">2- </w:t>
       </w:r>
       <w:r>
-        <w:t>Status of</w:t>
-      </w:r>
-      <w:r>
-        <w:t xml:space="preserve"> </w:t>
+        <w:t xml:space="preserve">Status of </w:t>
       </w:r>
       <w:r>
         <w:rPr>
@@ -2750,16 +2765,7 @@
         <w:t xml:space="preserve"> must be ( </w:t>
       </w:r>
       <w:r>
-        <w:t>Acceptable</w:t>
-      </w:r>
-      <w:r>
-        <w:t xml:space="preserve"> or </w:t>
-      </w:r>
-      <w:r>
-        <w:t>Rejected</w:t>
-      </w:r>
-      <w:r>
-        <w:t xml:space="preserve"> depending on the percentage) if percentage&gt;</w:t>
+        <w:t>Acceptable or Rejected depending on the percentage) if percentage&gt;</w:t>
       </w:r>
       <w:r>
         <w:t>20%, it is rejected.</w:t>
@@ -7080,7 +7086,6 @@
   <w:style w:type="character" w:default="1" w:styleId="DefaultParagraphFont">
     <w:name w:val="Default Paragraph Font"/>
     <w:uiPriority w:val="1"/>
-    <w:semiHidden/>
     <w:unhideWhenUsed/>
   </w:style>
   <w:style w:type="table" w:default="1" w:styleId="TableNormal">

</xml_diff>